<commit_message>
test: raise rough-2D oracle to a converged step count (5x)
The report's convergence-by-frame sweep showed pointwise RMS still
dropping noticeably between 70% and 100% of the original 10,000-step
production budget - not yet plateaued. Raised PRODUCTION_STEPS to 50,000
(2500 samples/window); the same sweep now flattens out (control RMS
0.157 -> 0.097 kcal/mol, frac_used 60% -> 66%, fraction-to-fraction
deltas down to a few hundredths by the end) instead of still trending
steeply down. Mutation margins stay huge (14x-730x control vs the prior
8x-400x) since the mutations are wrong physics, not sampling noise.

Regenerated the report against the new step count and re-verified all
three embedded plots directly. Runtime for this one file is now ~800s
(~13 min), up from ~150s - the direct, disclosed cost of asking for
convergence rather than just a pass.
</commit_message>
<xml_diff>
--- a/gareus_thermodynamic_validity_2d_rough_report.docx
+++ b/gareus_thermodynamic_validity_2d_rough_report.docx
@@ -33,7 +33,7 @@
     </w:p>
     <w:p>
       <w:r>
-        <w:t>Result: control recovers the full surface with pointwise RMS(F-V)=0.157 kcal/mol (ESS 28.3%, 60.4% of bins adequately sampled). A 4-mutation battery (mis-scaled bias, dropped bias, sign-flipped bias, and — the case this file exists for — the secondary-CV bias stripped from reconstruction) is caught at RMS 1.3-64 kcal/mol, 8x-400x the control. Real MD ran across 364 windows (31s); MBAR solved via the numba-anderson backend (pure-NumPy backends were empirically too slow at this scale — see Section 5).</w:t>
+        <w:t>Result: control recovers the full surface with pointwise RMS(F-V)=0.097 kcal/mol (ESS 28.1%, 66.3% of bins adequately sampled). A 4-mutation battery (mis-scaled bias, dropped bias, sign-flipped bias, and — the case this file exists for — the secondary-CV bias stripped from reconstruction) is caught at RMS 1.3-64 kcal/mol, 8x-400x the control. Real MD ran across 364 windows (87s); MBAR solved via the numba-anderson backend (pure-NumPy backends were empirically too slow at this scale — see Section 5).</w:t>
       </w:r>
     </w:p>
     <w:p>
@@ -213,7 +213,7 @@
               <w:rPr>
                 <w:sz w:val="17"/>
               </w:rPr>
-              <w:t>0.117</w:t>
+              <w:t>0.166</w:t>
             </w:r>
           </w:p>
         </w:tc>
@@ -227,7 +227,7 @@
               <w:rPr>
                 <w:sz w:val="17"/>
               </w:rPr>
-              <w:t>0.086</w:t>
+              <w:t>0.165</w:t>
             </w:r>
           </w:p>
         </w:tc>
@@ -241,7 +241,7 @@
               <w:rPr>
                 <w:sz w:val="17"/>
               </w:rPr>
-              <w:t>-0.031</w:t>
+              <w:t>-0.001</w:t>
             </w:r>
           </w:p>
         </w:tc>
@@ -255,7 +255,7 @@
               <w:rPr>
                 <w:sz w:val="17"/>
               </w:rPr>
-              <w:t>0.023</w:t>
+              <w:t>0.018</w:t>
             </w:r>
           </w:p>
         </w:tc>
@@ -285,7 +285,7 @@
               <w:rPr>
                 <w:sz w:val="17"/>
               </w:rPr>
-              <w:t>0.437</w:t>
+              <w:t>0.395</w:t>
             </w:r>
           </w:p>
         </w:tc>
@@ -299,7 +299,7 @@
               <w:rPr>
                 <w:sz w:val="17"/>
               </w:rPr>
-              <w:t>0.541</w:t>
+              <w:t>0.485</w:t>
             </w:r>
           </w:p>
         </w:tc>
@@ -313,7 +313,7 @@
               <w:rPr>
                 <w:sz w:val="17"/>
               </w:rPr>
-              <w:t>+0.105</w:t>
+              <w:t>+0.090</w:t>
             </w:r>
           </w:p>
         </w:tc>
@@ -327,7 +327,7 @@
               <w:rPr>
                 <w:sz w:val="17"/>
               </w:rPr>
-              <w:t>0.021</w:t>
+              <w:t>0.017</w:t>
             </w:r>
           </w:p>
         </w:tc>
@@ -357,7 +357,7 @@
               <w:rPr>
                 <w:sz w:val="17"/>
               </w:rPr>
-              <w:t>5.679</w:t>
+              <w:t>5.695</w:t>
             </w:r>
           </w:p>
         </w:tc>
@@ -371,7 +371,7 @@
               <w:rPr>
                 <w:sz w:val="17"/>
               </w:rPr>
-              <w:t>5.589</w:t>
+              <w:t>5.731</w:t>
             </w:r>
           </w:p>
         </w:tc>
@@ -385,7 +385,7 @@
               <w:rPr>
                 <w:sz w:val="17"/>
               </w:rPr>
-              <w:t>-0.090</w:t>
+              <w:t>+0.036</w:t>
             </w:r>
           </w:p>
         </w:tc>
@@ -399,7 +399,7 @@
               <w:rPr>
                 <w:sz w:val="17"/>
               </w:rPr>
-              <w:t>0.013</w:t>
+              <w:t>0.011</w:t>
             </w:r>
           </w:p>
         </w:tc>
@@ -429,7 +429,7 @@
               <w:rPr>
                 <w:sz w:val="17"/>
               </w:rPr>
-              <w:t>6.049</w:t>
+              <w:t>6.080</w:t>
             </w:r>
           </w:p>
         </w:tc>
@@ -443,7 +443,7 @@
               <w:rPr>
                 <w:sz w:val="17"/>
               </w:rPr>
-              <w:t>6.436</w:t>
+              <w:t>6.169</w:t>
             </w:r>
           </w:p>
         </w:tc>
@@ -457,7 +457,7 @@
               <w:rPr>
                 <w:sz w:val="17"/>
               </w:rPr>
-              <w:t>+0.387</w:t>
+              <w:t>+0.089</w:t>
             </w:r>
           </w:p>
         </w:tc>
@@ -471,7 +471,7 @@
               <w:rPr>
                 <w:sz w:val="17"/>
               </w:rPr>
-              <w:t>0.007</w:t>
+              <w:t>0.018</w:t>
             </w:r>
           </w:p>
         </w:tc>
@@ -501,7 +501,7 @@
               <w:rPr>
                 <w:sz w:val="17"/>
               </w:rPr>
-              <w:t>5.963</w:t>
+              <w:t>6.059</w:t>
             </w:r>
           </w:p>
         </w:tc>
@@ -515,7 +515,7 @@
               <w:rPr>
                 <w:sz w:val="17"/>
               </w:rPr>
-              <w:t>6.050</w:t>
+              <w:t>6.361</w:t>
             </w:r>
           </w:p>
         </w:tc>
@@ -529,7 +529,7 @@
               <w:rPr>
                 <w:sz w:val="17"/>
               </w:rPr>
-              <w:t>+0.087</w:t>
+              <w:t>+0.302</w:t>
             </w:r>
           </w:p>
         </w:tc>
@@ -543,7 +543,7 @@
               <w:rPr>
                 <w:sz w:val="17"/>
               </w:rPr>
-              <w:t>0.020</w:t>
+              <w:t>0.005</w:t>
             </w:r>
           </w:p>
         </w:tc>
@@ -573,7 +573,7 @@
               <w:rPr>
                 <w:sz w:val="17"/>
               </w:rPr>
-              <w:t>0.273</w:t>
+              <w:t>0.341</w:t>
             </w:r>
           </w:p>
         </w:tc>
@@ -587,7 +587,7 @@
               <w:rPr>
                 <w:sz w:val="17"/>
               </w:rPr>
-              <w:t>0.261</w:t>
+              <w:t>0.396</w:t>
             </w:r>
           </w:p>
         </w:tc>
@@ -601,7 +601,7 @@
               <w:rPr>
                 <w:sz w:val="17"/>
               </w:rPr>
-              <w:t>-0.012</w:t>
+              <w:t>+0.055</w:t>
             </w:r>
           </w:p>
         </w:tc>
@@ -615,7 +615,7 @@
               <w:rPr>
                 <w:sz w:val="17"/>
               </w:rPr>
-              <w:t>0.021</w:t>
+              <w:t>0.024</w:t>
             </w:r>
           </w:p>
         </w:tc>
@@ -645,7 +645,7 @@
               <w:rPr>
                 <w:sz w:val="17"/>
               </w:rPr>
-              <w:t>1.259</w:t>
+              <w:t>1.228</w:t>
             </w:r>
           </w:p>
         </w:tc>
@@ -659,7 +659,7 @@
               <w:rPr>
                 <w:sz w:val="17"/>
               </w:rPr>
-              <w:t>1.406</w:t>
+              <w:t>1.271</w:t>
             </w:r>
           </w:p>
         </w:tc>
@@ -673,7 +673,7 @@
               <w:rPr>
                 <w:sz w:val="17"/>
               </w:rPr>
-              <w:t>+0.147</w:t>
+              <w:t>+0.044</w:t>
             </w:r>
           </w:p>
         </w:tc>
@@ -717,7 +717,7 @@
               <w:rPr>
                 <w:sz w:val="17"/>
               </w:rPr>
-              <w:t>2.864</w:t>
+              <w:t>2.891</w:t>
             </w:r>
           </w:p>
         </w:tc>
@@ -731,7 +731,7 @@
               <w:rPr>
                 <w:sz w:val="17"/>
               </w:rPr>
-              <w:t>2.827</w:t>
+              <w:t>2.938</w:t>
             </w:r>
           </w:p>
         </w:tc>
@@ -745,7 +745,7 @@
               <w:rPr>
                 <w:sz w:val="17"/>
               </w:rPr>
-              <w:t>-0.036</w:t>
+              <w:t>+0.047</w:t>
             </w:r>
           </w:p>
         </w:tc>
@@ -759,7 +759,7 @@
               <w:rPr>
                 <w:sz w:val="17"/>
               </w:rPr>
-              <w:t>0.006</w:t>
+              <w:t>0.001</w:t>
             </w:r>
           </w:p>
         </w:tc>
@@ -888,7 +888,7 @@
               <w:rPr>
                 <w:sz w:val="16"/>
               </w:rPr>
-              <w:t>0.157</w:t>
+              <w:t>0.097</w:t>
             </w:r>
           </w:p>
         </w:tc>
@@ -902,7 +902,7 @@
               <w:rPr>
                 <w:sz w:val="16"/>
               </w:rPr>
-              <w:t>28.3%</w:t>
+              <w:t>28.1%</w:t>
             </w:r>
           </w:p>
         </w:tc>
@@ -960,7 +960,7 @@
               <w:rPr>
                 <w:sz w:val="16"/>
               </w:rPr>
-              <w:t>1.304</w:t>
+              <w:t>1.377</w:t>
             </w:r>
           </w:p>
         </w:tc>
@@ -974,7 +974,7 @@
               <w:rPr>
                 <w:sz w:val="16"/>
               </w:rPr>
-              <w:t>35.3%</w:t>
+              <w:t>36.2%</w:t>
             </w:r>
           </w:p>
         </w:tc>
@@ -1032,7 +1032,7 @@
               <w:rPr>
                 <w:sz w:val="16"/>
               </w:rPr>
-              <w:t>3.482</w:t>
+              <w:t>3.491</w:t>
             </w:r>
           </w:p>
         </w:tc>
@@ -1104,7 +1104,7 @@
               <w:rPr>
                 <w:sz w:val="16"/>
               </w:rPr>
-              <w:t>64.150</w:t>
+              <w:t>70.515</w:t>
             </w:r>
           </w:p>
         </w:tc>
@@ -1176,7 +1176,7 @@
               <w:rPr>
                 <w:sz w:val="16"/>
               </w:rPr>
-              <w:t>1.404</w:t>
+              <w:t>1.398</w:t>
             </w:r>
           </w:p>
         </w:tc>
@@ -1190,7 +1190,7 @@
               <w:rPr>
                 <w:sz w:val="16"/>
               </w:rPr>
-              <w:t>49.9%</w:t>
+              <w:t>49.0%</w:t>
             </w:r>
           </w:p>
         </w:tc>
@@ -1344,7 +1344,7 @@
               <w:rPr>
                 <w:sz w:val="17"/>
               </w:rPr>
-              <w:t>0.377</w:t>
+              <w:t>0.223</w:t>
             </w:r>
           </w:p>
         </w:tc>
@@ -1358,7 +1358,7 @@
               <w:rPr>
                 <w:sz w:val="17"/>
               </w:rPr>
-              <w:t>27.3%</w:t>
+              <w:t>28.5%</w:t>
             </w:r>
           </w:p>
         </w:tc>
@@ -1372,7 +1372,7 @@
               <w:rPr>
                 <w:sz w:val="17"/>
               </w:rPr>
-              <w:t>11.6%</w:t>
+              <w:t>57.7%</w:t>
             </w:r>
           </w:p>
         </w:tc>
@@ -1416,7 +1416,7 @@
               <w:rPr>
                 <w:sz w:val="17"/>
               </w:rPr>
-              <w:t>0.341</w:t>
+              <w:t>0.157</w:t>
             </w:r>
           </w:p>
         </w:tc>
@@ -1444,7 +1444,7 @@
               <w:rPr>
                 <w:sz w:val="17"/>
               </w:rPr>
-              <w:t>34.7%</w:t>
+              <w:t>60.5%</w:t>
             </w:r>
           </w:p>
         </w:tc>
@@ -1488,7 +1488,7 @@
               <w:rPr>
                 <w:sz w:val="17"/>
               </w:rPr>
-              <w:t>0.282</w:t>
+              <w:t>0.131</w:t>
             </w:r>
           </w:p>
         </w:tc>
@@ -1502,7 +1502,7 @@
               <w:rPr>
                 <w:sz w:val="17"/>
               </w:rPr>
-              <w:t>28.3%</w:t>
+              <w:t>28.5%</w:t>
             </w:r>
           </w:p>
         </w:tc>
@@ -1516,7 +1516,7 @@
               <w:rPr>
                 <w:sz w:val="17"/>
               </w:rPr>
-              <w:t>47.2%</w:t>
+              <w:t>62.3%</w:t>
             </w:r>
           </w:p>
         </w:tc>
@@ -1560,7 +1560,7 @@
               <w:rPr>
                 <w:sz w:val="17"/>
               </w:rPr>
-              <w:t>0.255</w:t>
+              <w:t>0.125</w:t>
             </w:r>
           </w:p>
         </w:tc>
@@ -1574,7 +1574,7 @@
               <w:rPr>
                 <w:sz w:val="17"/>
               </w:rPr>
-              <w:t>28.2%</w:t>
+              <w:t>27.7%</w:t>
             </w:r>
           </w:p>
         </w:tc>
@@ -1588,7 +1588,7 @@
               <w:rPr>
                 <w:sz w:val="17"/>
               </w:rPr>
-              <w:t>57.7%</w:t>
+              <w:t>63.9%</w:t>
             </w:r>
           </w:p>
         </w:tc>
@@ -1632,7 +1632,7 @@
               <w:rPr>
                 <w:sz w:val="17"/>
               </w:rPr>
-              <w:t>0.176</w:t>
+              <w:t>0.115</w:t>
             </w:r>
           </w:p>
         </w:tc>
@@ -1646,7 +1646,7 @@
               <w:rPr>
                 <w:sz w:val="17"/>
               </w:rPr>
-              <w:t>28.6%</w:t>
+              <w:t>27.8%</w:t>
             </w:r>
           </w:p>
         </w:tc>
@@ -1660,7 +1660,7 @@
               <w:rPr>
                 <w:sz w:val="17"/>
               </w:rPr>
-              <w:t>59.8%</w:t>
+              <w:t>65.3%</w:t>
             </w:r>
           </w:p>
         </w:tc>
@@ -1704,7 +1704,7 @@
               <w:rPr>
                 <w:sz w:val="17"/>
               </w:rPr>
-              <w:t>0.157</w:t>
+              <w:t>0.097</w:t>
             </w:r>
           </w:p>
         </w:tc>
@@ -1718,7 +1718,7 @@
               <w:rPr>
                 <w:sz w:val="17"/>
               </w:rPr>
-              <w:t>28.3%</w:t>
+              <w:t>28.1%</w:t>
             </w:r>
           </w:p>
         </w:tc>
@@ -1732,7 +1732,7 @@
               <w:rPr>
                 <w:sz w:val="17"/>
               </w:rPr>
-              <w:t>60.4%</w:t>
+              <w:t>66.3%</w:t>
             </w:r>
           </w:p>
         </w:tc>
@@ -1798,7 +1798,7 @@
     </w:p>
     <w:p>
       <w:r>
-        <w:t>Pure-NumPy backends ("numpy", "anderson") were empirically too slow to compare directly on the full 364-window/182,000-sample control problem (minutes, vs seconds for the Numba-accelerated backends) — this section instead compares every backend on a smaller, subsampled version of the SAME real MD data (every 7th window, 120 samples/window -&gt; K=52, N=6240), so every solver, including the slow ones, finishes in a reasonable time. The headline control/mutation/convergence numbers above all used the FULL dataset with numba-anderson, not this subsampled comparison. Because it is a much smaller, sparser problem (52 of 364 windows), its own RMS-vs-truth values are not comparable to Sections 1-3's — this section is about solver-to-solver agreement, not a second accuracy headline.</w:t>
+        <w:t>Pure-NumPy backends ("numpy", "anderson") were empirically too slow to compare directly on the full 364-window/910,000-sample control problem (minutes, vs seconds for the Numba-accelerated backends) — this section instead compares every backend on a smaller, subsampled version of the SAME real MD data (every 7th window, 120 samples/window -&gt; K=52, N=6240), so every solver, including the slow ones, finishes in a reasonable time. The headline control/mutation/convergence numbers above all used the FULL dataset with numba-anderson, not this subsampled comparison. Because it is a much smaller, sparser problem (52 of 364 windows), its own RMS-vs-truth values are not comparable to Sections 1-3's — this section is about solver-to-solver agreement, not a second accuracy headline.</w:t>
       </w:r>
     </w:p>
     <w:tbl>
@@ -1916,7 +1916,7 @@
               <w:rPr>
                 <w:sz w:val="17"/>
               </w:rPr>
-              <w:t>23.84s</w:t>
+              <w:t>11.21s</w:t>
             </w:r>
           </w:p>
         </w:tc>
@@ -1958,7 +1958,7 @@
               <w:rPr>
                 <w:sz w:val="17"/>
               </w:rPr>
-              <w:t>0.542</w:t>
+              <w:t>0.705</w:t>
             </w:r>
           </w:p>
         </w:tc>
@@ -1988,7 +1988,7 @@
               <w:rPr>
                 <w:sz w:val="17"/>
               </w:rPr>
-              <w:t>3.53s</w:t>
+              <w:t>1.08s</w:t>
             </w:r>
           </w:p>
         </w:tc>
@@ -2002,7 +2002,7 @@
               <w:rPr>
                 <w:sz w:val="17"/>
               </w:rPr>
-              <w:t>435</w:t>
+              <w:t>292</w:t>
             </w:r>
           </w:p>
         </w:tc>
@@ -2030,7 +2030,7 @@
               <w:rPr>
                 <w:sz w:val="17"/>
               </w:rPr>
-              <w:t>1.623</w:t>
+              <w:t>0.948</w:t>
             </w:r>
           </w:p>
         </w:tc>
@@ -2060,7 +2060,7 @@
               <w:rPr>
                 <w:sz w:val="17"/>
               </w:rPr>
-              <w:t>2.02s</w:t>
+              <w:t>1.79s</w:t>
             </w:r>
           </w:p>
         </w:tc>
@@ -2102,7 +2102,7 @@
               <w:rPr>
                 <w:sz w:val="17"/>
               </w:rPr>
-              <w:t>0.542</w:t>
+              <w:t>0.705</w:t>
             </w:r>
           </w:p>
         </w:tc>
@@ -2132,7 +2132,7 @@
               <w:rPr>
                 <w:sz w:val="17"/>
               </w:rPr>
-              <w:t>0.22s</w:t>
+              <w:t>0.26s</w:t>
             </w:r>
           </w:p>
         </w:tc>
@@ -2146,7 +2146,7 @@
               <w:rPr>
                 <w:sz w:val="17"/>
               </w:rPr>
-              <w:t>275</w:t>
+              <w:t>387</w:t>
             </w:r>
           </w:p>
         </w:tc>
@@ -2174,7 +2174,7 @@
               <w:rPr>
                 <w:sz w:val="17"/>
               </w:rPr>
-              <w:t>1.623</w:t>
+              <w:t>0.948</w:t>
             </w:r>
           </w:p>
         </w:tc>
@@ -2204,7 +2204,7 @@
               <w:rPr>
                 <w:sz w:val="17"/>
               </w:rPr>
-              <w:t>1.67s</w:t>
+              <w:t>0.66s</w:t>
             </w:r>
           </w:p>
         </w:tc>
@@ -2218,7 +2218,7 @@
               <w:rPr>
                 <w:sz w:val="17"/>
               </w:rPr>
-              <w:t>204</w:t>
+              <w:t>179</w:t>
             </w:r>
           </w:p>
         </w:tc>
@@ -2246,7 +2246,7 @@
               <w:rPr>
                 <w:sz w:val="17"/>
               </w:rPr>
-              <w:t>1.623</w:t>
+              <w:t>0.948</w:t>
             </w:r>
           </w:p>
         </w:tc>
@@ -2324,7 +2324,7 @@
               <w:rPr>
                 <w:sz w:val="17"/>
               </w:rPr>
-              <w:t>1.7602 kcal/mol</w:t>
+              <w:t>0.4936 kcal/mol</w:t>
             </w:r>
           </w:p>
         </w:tc>
@@ -2384,7 +2384,7 @@
               <w:rPr>
                 <w:sz w:val="17"/>
               </w:rPr>
-              <w:t>1.7601 kcal/mol</w:t>
+              <w:t>0.4936 kcal/mol</w:t>
             </w:r>
           </w:p>
         </w:tc>
@@ -2414,7 +2414,7 @@
               <w:rPr>
                 <w:sz w:val="17"/>
               </w:rPr>
-              <w:t>1.7601 kcal/mol</w:t>
+              <w:t>0.4936 kcal/mol</w:t>
             </w:r>
           </w:p>
         </w:tc>
@@ -2444,7 +2444,7 @@
               <w:rPr>
                 <w:sz w:val="17"/>
               </w:rPr>
-              <w:t>1.7602 kcal/mol</w:t>
+              <w:t>0.4936 kcal/mol</w:t>
             </w:r>
           </w:p>
         </w:tc>
@@ -2474,7 +2474,7 @@
               <w:rPr>
                 <w:sz w:val="17"/>
               </w:rPr>
-              <w:t>0.0001 kcal/mol</w:t>
+              <w:t>0.0000 kcal/mol</w:t>
             </w:r>
           </w:p>
         </w:tc>
@@ -2504,7 +2504,7 @@
               <w:rPr>
                 <w:sz w:val="17"/>
               </w:rPr>
-              <w:t>0.0001 kcal/mol</w:t>
+              <w:t>0.0000 kcal/mol</w:t>
             </w:r>
           </w:p>
         </w:tc>
@@ -2534,7 +2534,7 @@
               <w:rPr>
                 <w:sz w:val="17"/>
               </w:rPr>
-              <w:t>1.7601 kcal/mol</w:t>
+              <w:t>0.4936 kcal/mol</w:t>
             </w:r>
           </w:p>
         </w:tc>
@@ -2564,7 +2564,7 @@
               <w:rPr>
                 <w:sz w:val="17"/>
               </w:rPr>
-              <w:t>1.7601 kcal/mol</w:t>
+              <w:t>0.4936 kcal/mol</w:t>
             </w:r>
           </w:p>
         </w:tc>
@@ -2594,7 +2594,7 @@
               <w:rPr>
                 <w:sz w:val="17"/>
               </w:rPr>
-              <w:t>0.0001 kcal/mol</w:t>
+              <w:t>0.0000 kcal/mol</w:t>
             </w:r>
           </w:p>
         </w:tc>
@@ -2602,7 +2602,7 @@
     </w:tbl>
     <w:p>
       <w:r>
-        <w:t>Finding: the plain fixed-point backends (numpy, numba) did NOT converge within the 3000-iteration cap on this real, noisy, multi-basin dataset. The accelerated/quasi-Newton backends (anderson, numba-anderson, lbfgs) DID converge and agree with each other to within 1.8e+00 kcal/mol — mutual agreement between independent algorithms reaching the same fixed point, the actual cross-validation signal here.</w:t>
+        <w:t>Finding: the plain fixed-point backends (numpy, numba) did NOT converge within the 3000-iteration cap on this real, noisy, multi-basin dataset. The accelerated/quasi-Newton backends (anderson, numba-anderson, lbfgs) DID converge and agree with each other to within 4.9e-01 kcal/mol — mutual agreement between independent algorithms reaching the same fixed point, the actual cross-validation signal here.</w:t>
       </w:r>
     </w:p>
     <w:p>

</xml_diff>

<commit_message>
fix: compute mutation-battery RMS range live in rough-2D report
The executive-summary paragraph had a hardcoded "RMS 1.3-64 kcal/mol,
8x-400x the control" literal, left over from before the 5x step-count
convergence fix. It silently went stale (actual current values: RMS
1.4-70.5 kcal/mol, 14x-725x control) while the report text claims "All
numbers... computed by a live run... not transcribed." Found via
adversarial merge/integrity review.

Now derived directly from mut_rows at render time, so it can't drift
out of sync with the actual run again. Verified in the regenerated
docx: stale strings absent, live numbers present and correct.
</commit_message>
<xml_diff>
--- a/gareus_thermodynamic_validity_2d_rough_report.docx
+++ b/gareus_thermodynamic_validity_2d_rough_report.docx
@@ -33,7 +33,7 @@
     </w:p>
     <w:p>
       <w:r>
-        <w:t>Result: control recovers the full surface with pointwise RMS(F-V)=0.097 kcal/mol (ESS 28.1%, 66.3% of bins adequately sampled). A 4-mutation battery (mis-scaled bias, dropped bias, sign-flipped bias, and — the case this file exists for — the secondary-CV bias stripped from reconstruction) is caught at RMS 1.3-64 kcal/mol, 8x-400x the control. Real MD ran across 364 windows (87s); MBAR solved via the numba-anderson backend (pure-NumPy backends were empirically too slow at this scale — see Section 5).</w:t>
+        <w:t>Result: control recovers the full surface with pointwise RMS(F-V)=0.097 kcal/mol (ESS 28.1%, 66.3% of bins adequately sampled). A 4-mutation battery (mis-scaled bias, dropped bias, sign-flipped bias, and — the case this file exists for — the secondary-CV bias stripped from reconstruction) is caught at RMS 1.4-70.5 kcal/mol, 14x-725x the control. Real MD ran across 364 windows (252s); MBAR solved via the numba-anderson backend (pure-NumPy backends were empirically too slow at this scale — see Section 5).</w:t>
       </w:r>
     </w:p>
     <w:p>
@@ -1916,7 +1916,7 @@
               <w:rPr>
                 <w:sz w:val="17"/>
               </w:rPr>
-              <w:t>11.21s</w:t>
+              <w:t>10.99s</w:t>
             </w:r>
           </w:p>
         </w:tc>
@@ -1988,7 +1988,7 @@
               <w:rPr>
                 <w:sz w:val="17"/>
               </w:rPr>
-              <w:t>1.08s</w:t>
+              <w:t>1.07s</w:t>
             </w:r>
           </w:p>
         </w:tc>
@@ -2060,7 +2060,7 @@
               <w:rPr>
                 <w:sz w:val="17"/>
               </w:rPr>
-              <w:t>1.79s</w:t>
+              <w:t>1.68s</w:t>
             </w:r>
           </w:p>
         </w:tc>
@@ -2132,7 +2132,7 @@
               <w:rPr>
                 <w:sz w:val="17"/>
               </w:rPr>
-              <w:t>0.26s</w:t>
+              <w:t>0.25s</w:t>
             </w:r>
           </w:p>
         </w:tc>
@@ -2204,7 +2204,7 @@
               <w:rPr>
                 <w:sz w:val="17"/>
               </w:rPr>
-              <w:t>0.66s</w:t>
+              <w:t>0.67s</w:t>
             </w:r>
           </w:p>
         </w:tc>

</xml_diff>